<commit_message>
Add virtual screening episode naming
</commit_message>
<xml_diff>
--- a/New Art Naming Conventions.docx
+++ b/New Art Naming Conventions.docx
@@ -1079,6 +1079,39 @@
           <w:sz-cs w:val="24"/>
           <w:spacing w:val="0"/>
         </w:rPr>
+        <w:t xml:space="preserve">Virtual Screening Episode</w:t>
+      </w:r>
+    </w:p>
+    <w:p>
+      <w:pPr/>
+      <w:r>
+        <w:rPr>
+          <w:rFonts w:ascii="Courier" w:hAnsi="Courier" w:cs="Courier"/>
+          <w:sz w:val="26"/>
+          <w:sz-cs w:val="26"/>
+          <w:spacing w:val="0"/>
+        </w:rPr>
+        <w:t xml:space="preserve">bg</w:t>
+      </w:r>
+      <w:r>
+        <w:rPr>
+          <w:rFonts w:ascii="Times" w:hAnsi="Times" w:cs="Times"/>
+          <w:sz w:val="24"/>
+          <w:sz-cs w:val="24"/>
+          <w:spacing w:val="0"/>
+        </w:rPr>
+        <w:t xml:space="preserve"/>
+      </w:r>
+    </w:p>
+    <w:p>
+      <w:pPr/>
+      <w:r>
+        <w:rPr>
+          <w:rFonts w:ascii="Times" w:hAnsi="Times" w:cs="Times"/>
+          <w:sz w:val="24"/>
+          <w:sz-cs w:val="24"/>
+          <w:spacing w:val="0"/>
+        </w:rPr>
         <w:t xml:space="preserve">Trailer</w:t>
       </w:r>
     </w:p>
@@ -4415,7 +4448,7 @@
           <w:b/>
           <w:spacing w:val="0"/>
         </w:rPr>
-        <w:t xml:space="preserve">Trailer</w:t>
+        <w:t xml:space="preserve">Virtual Screening Episode</w:t>
       </w:r>
     </w:p>
     <w:p>
@@ -4443,7 +4476,7 @@
           <w:sz-cs w:val="26"/>
           <w:spacing w:val="0"/>
         </w:rPr>
-        <w:t xml:space="preserve">[title]_trailer_[language]_[art_tag]_[aspect_ratio]_[dimensions].[extension]</w:t>
+        <w:t xml:space="preserve">[series_name]_s[xx]_e[xx]_virtual_screening_[language]_[art_tag]_[aspect_ratio]_[dimensions].[extension]</w:t>
       </w:r>
       <w:r>
         <w:rPr>
@@ -4492,7 +4525,7 @@
           <w:sz-cs w:val="24"/>
           <w:spacing w:val="0"/>
         </w:rPr>
-        <w:t xml:space="preserve">Title</w:t>
+        <w:t xml:space="preserve">Series Name</w:t>
       </w:r>
     </w:p>
     <w:p>
@@ -4518,7 +4551,7 @@
           <w:sz-cs w:val="24"/>
           <w:spacing w:val="0"/>
         </w:rPr>
-        <w:t xml:space="preserve">Language</w:t>
+        <w:t xml:space="preserve">Season</w:t>
       </w:r>
     </w:p>
     <w:p>
@@ -4544,7 +4577,7 @@
           <w:sz-cs w:val="24"/>
           <w:spacing w:val="0"/>
         </w:rPr>
-        <w:t xml:space="preserve">Art Tag</w:t>
+        <w:t xml:space="preserve">Episode</w:t>
       </w:r>
     </w:p>
     <w:p>
@@ -4570,7 +4603,7 @@
           <w:sz-cs w:val="24"/>
           <w:spacing w:val="0"/>
         </w:rPr>
-        <w:t xml:space="preserve">Aspect Ratio</w:t>
+        <w:t xml:space="preserve">Language</w:t>
       </w:r>
     </w:p>
     <w:p>
@@ -4596,6 +4629,58 @@
           <w:sz-cs w:val="24"/>
           <w:spacing w:val="0"/>
         </w:rPr>
+        <w:t xml:space="preserve">Art Tag</w:t>
+      </w:r>
+    </w:p>
+    <w:p>
+      <w:pPr>
+        <w:ind w:left="720" w:first-line="-720"/>
+      </w:pPr>
+      <w:r>
+        <w:rPr>
+          <w:rFonts w:ascii="Times" w:hAnsi="Times" w:cs="Times"/>
+          <w:sz w:val="24"/>
+          <w:sz-cs w:val="24"/>
+        </w:rPr>
+        <w:t xml:space="preserve"/>
+        <w:tab/>
+        <w:t xml:space="preserve">•</w:t>
+        <w:tab/>
+        <w:t xml:space="preserve"/>
+      </w:r>
+      <w:r>
+        <w:rPr>
+          <w:rFonts w:ascii="Times" w:hAnsi="Times" w:cs="Times"/>
+          <w:sz w:val="24"/>
+          <w:sz-cs w:val="24"/>
+          <w:spacing w:val="0"/>
+        </w:rPr>
+        <w:t xml:space="preserve">Aspect Ratio</w:t>
+      </w:r>
+    </w:p>
+    <w:p>
+      <w:pPr>
+        <w:ind w:left="720" w:first-line="-720"/>
+      </w:pPr>
+      <w:r>
+        <w:rPr>
+          <w:rFonts w:ascii="Times" w:hAnsi="Times" w:cs="Times"/>
+          <w:sz w:val="24"/>
+          <w:sz-cs w:val="24"/>
+        </w:rPr>
+        <w:t xml:space="preserve"/>
+        <w:tab/>
+        <w:t xml:space="preserve">•</w:t>
+        <w:tab/>
+        <w:t xml:space="preserve"/>
+      </w:r>
+      <w:r>
+        <w:rPr>
+          <w:rFonts w:ascii="Times" w:hAnsi="Times" w:cs="Times"/>
+          <w:sz w:val="24"/>
+          <w:sz-cs w:val="24"/>
+          <w:spacing w:val="0"/>
+        </w:rPr>
         <w:t xml:space="preserve">Dimensions</w:t>
       </w:r>
     </w:p>
@@ -4624,7 +4709,7 @@
           <w:sz-cs w:val="26"/>
           <w:spacing w:val="0"/>
         </w:rPr>
-        <w:t xml:space="preserve">gods_not_dead_trailer_eng_bg_16x9_1920x1080.jpg</w:t>
+        <w:t xml:space="preserve">when_hope_calls_s03_e02_virtual_screening_eng_bg_16x9_1920x1080.jpg</w:t>
       </w:r>
       <w:r>
         <w:rPr>
@@ -4648,7 +4733,7 @@
           <w:b/>
           <w:spacing w:val="0"/>
         </w:rPr>
-        <w:t xml:space="preserve">Extras</w:t>
+        <w:t xml:space="preserve">Trailer</w:t>
       </w:r>
     </w:p>
     <w:p>
@@ -4676,7 +4761,7 @@
           <w:sz-cs w:val="26"/>
           <w:spacing w:val="0"/>
         </w:rPr>
-        <w:t xml:space="preserve">[title]_[extra_prefix]_[language]_[art_tag]_[aspect_ratio]_[dimensions].[extension]</w:t>
+        <w:t xml:space="preserve">[title]_trailer_[language]_[art_tag]_[aspect_ratio]_[dimensions].[extension]</w:t>
       </w:r>
       <w:r>
         <w:rPr>
@@ -4777,7 +4862,7 @@
           <w:sz-cs w:val="24"/>
           <w:spacing w:val="0"/>
         </w:rPr>
-        <w:t xml:space="preserve">Extra Type</w:t>
+        <w:t xml:space="preserve">Art Tag</w:t>
       </w:r>
     </w:p>
     <w:p>
@@ -4803,7 +4888,7 @@
           <w:sz-cs w:val="24"/>
           <w:spacing w:val="0"/>
         </w:rPr>
-        <w:t xml:space="preserve">Art Tag</w:t>
+        <w:t xml:space="preserve">Aspect Ratio</w:t>
       </w:r>
     </w:p>
     <w:p>
@@ -4829,7 +4914,110 @@
           <w:sz-cs w:val="24"/>
           <w:spacing w:val="0"/>
         </w:rPr>
-        <w:t xml:space="preserve">Aspect Ratio</w:t>
+        <w:t xml:space="preserve">Dimensions</w:t>
+      </w:r>
+    </w:p>
+    <w:p>
+      <w:pPr>
+        <w:spacing w:after="240"/>
+      </w:pPr>
+      <w:r>
+        <w:rPr>
+          <w:rFonts w:ascii="Times" w:hAnsi="Times" w:cs="Times"/>
+          <w:sz w:val="24"/>
+          <w:sz-cs w:val="24"/>
+          <w:spacing w:val="0"/>
+        </w:rPr>
+        <w:t xml:space="preserve">Example:</w:t>
+      </w:r>
+    </w:p>
+    <w:p>
+      <w:pPr>
+        <w:spacing w:after="240"/>
+      </w:pPr>
+      <w:r>
+        <w:rPr>
+          <w:rFonts w:ascii="Courier" w:hAnsi="Courier" w:cs="Courier"/>
+          <w:sz w:val="26"/>
+          <w:sz-cs w:val="26"/>
+          <w:spacing w:val="0"/>
+        </w:rPr>
+        <w:t xml:space="preserve">gods_not_dead_trailer_eng_bg_16x9_1920x1080.jpg</w:t>
+      </w:r>
+      <w:r>
+        <w:rPr>
+          <w:rFonts w:ascii="Times" w:hAnsi="Times" w:cs="Times"/>
+          <w:sz w:val="24"/>
+          <w:sz-cs w:val="24"/>
+          <w:spacing w:val="0"/>
+        </w:rPr>
+        <w:t xml:space="preserve"/>
+      </w:r>
+    </w:p>
+    <w:p>
+      <w:pPr>
+        <w:spacing w:after="280"/>
+      </w:pPr>
+      <w:r>
+        <w:rPr>
+          <w:rFonts w:ascii="Times" w:hAnsi="Times" w:cs="Times"/>
+          <w:sz w:val="28"/>
+          <w:sz-cs w:val="28"/>
+          <w:b/>
+          <w:spacing w:val="0"/>
+        </w:rPr>
+        <w:t xml:space="preserve">Extras</w:t>
+      </w:r>
+    </w:p>
+    <w:p>
+      <w:pPr>
+        <w:spacing w:after="240"/>
+      </w:pPr>
+      <w:r>
+        <w:rPr>
+          <w:rFonts w:ascii="Times" w:hAnsi="Times" w:cs="Times"/>
+          <w:sz w:val="24"/>
+          <w:sz-cs w:val="24"/>
+          <w:spacing w:val="0"/>
+        </w:rPr>
+        <w:t xml:space="preserve">Formula:</w:t>
+      </w:r>
+    </w:p>
+    <w:p>
+      <w:pPr>
+        <w:spacing w:after="240"/>
+      </w:pPr>
+      <w:r>
+        <w:rPr>
+          <w:rFonts w:ascii="Courier" w:hAnsi="Courier" w:cs="Courier"/>
+          <w:sz w:val="26"/>
+          <w:sz-cs w:val="26"/>
+          <w:spacing w:val="0"/>
+        </w:rPr>
+        <w:t xml:space="preserve">[title]_[extra_prefix]_[language]_[art_tag]_[aspect_ratio]_[dimensions].[extension]</w:t>
+      </w:r>
+      <w:r>
+        <w:rPr>
+          <w:rFonts w:ascii="Times" w:hAnsi="Times" w:cs="Times"/>
+          <w:sz w:val="24"/>
+          <w:sz-cs w:val="24"/>
+          <w:spacing w:val="0"/>
+        </w:rPr>
+        <w:t xml:space="preserve"/>
+      </w:r>
+    </w:p>
+    <w:p>
+      <w:pPr>
+        <w:spacing w:after="240"/>
+      </w:pPr>
+      <w:r>
+        <w:rPr>
+          <w:rFonts w:ascii="Times" w:hAnsi="Times" w:cs="Times"/>
+          <w:sz w:val="24"/>
+          <w:sz-cs w:val="24"/>
+          <w:spacing w:val="0"/>
+        </w:rPr>
+        <w:t xml:space="preserve">Required fields:</w:t>
       </w:r>
     </w:p>
     <w:p>
@@ -4855,6 +5043,136 @@
           <w:sz-cs w:val="24"/>
           <w:spacing w:val="0"/>
         </w:rPr>
+        <w:t xml:space="preserve">Title</w:t>
+      </w:r>
+    </w:p>
+    <w:p>
+      <w:pPr>
+        <w:ind w:left="720" w:first-line="-720"/>
+      </w:pPr>
+      <w:r>
+        <w:rPr>
+          <w:rFonts w:ascii="Times" w:hAnsi="Times" w:cs="Times"/>
+          <w:sz w:val="24"/>
+          <w:sz-cs w:val="24"/>
+        </w:rPr>
+        <w:t xml:space="preserve"/>
+        <w:tab/>
+        <w:t xml:space="preserve">•</w:t>
+        <w:tab/>
+        <w:t xml:space="preserve"/>
+      </w:r>
+      <w:r>
+        <w:rPr>
+          <w:rFonts w:ascii="Times" w:hAnsi="Times" w:cs="Times"/>
+          <w:sz w:val="24"/>
+          <w:sz-cs w:val="24"/>
+          <w:spacing w:val="0"/>
+        </w:rPr>
+        <w:t xml:space="preserve">Language</w:t>
+      </w:r>
+    </w:p>
+    <w:p>
+      <w:pPr>
+        <w:ind w:left="720" w:first-line="-720"/>
+      </w:pPr>
+      <w:r>
+        <w:rPr>
+          <w:rFonts w:ascii="Times" w:hAnsi="Times" w:cs="Times"/>
+          <w:sz w:val="24"/>
+          <w:sz-cs w:val="24"/>
+        </w:rPr>
+        <w:t xml:space="preserve"/>
+        <w:tab/>
+        <w:t xml:space="preserve">•</w:t>
+        <w:tab/>
+        <w:t xml:space="preserve"/>
+      </w:r>
+      <w:r>
+        <w:rPr>
+          <w:rFonts w:ascii="Times" w:hAnsi="Times" w:cs="Times"/>
+          <w:sz w:val="24"/>
+          <w:sz-cs w:val="24"/>
+          <w:spacing w:val="0"/>
+        </w:rPr>
+        <w:t xml:space="preserve">Extra Type</w:t>
+      </w:r>
+    </w:p>
+    <w:p>
+      <w:pPr>
+        <w:ind w:left="720" w:first-line="-720"/>
+      </w:pPr>
+      <w:r>
+        <w:rPr>
+          <w:rFonts w:ascii="Times" w:hAnsi="Times" w:cs="Times"/>
+          <w:sz w:val="24"/>
+          <w:sz-cs w:val="24"/>
+        </w:rPr>
+        <w:t xml:space="preserve"/>
+        <w:tab/>
+        <w:t xml:space="preserve">•</w:t>
+        <w:tab/>
+        <w:t xml:space="preserve"/>
+      </w:r>
+      <w:r>
+        <w:rPr>
+          <w:rFonts w:ascii="Times" w:hAnsi="Times" w:cs="Times"/>
+          <w:sz w:val="24"/>
+          <w:sz-cs w:val="24"/>
+          <w:spacing w:val="0"/>
+        </w:rPr>
+        <w:t xml:space="preserve">Art Tag</w:t>
+      </w:r>
+    </w:p>
+    <w:p>
+      <w:pPr>
+        <w:ind w:left="720" w:first-line="-720"/>
+      </w:pPr>
+      <w:r>
+        <w:rPr>
+          <w:rFonts w:ascii="Times" w:hAnsi="Times" w:cs="Times"/>
+          <w:sz w:val="24"/>
+          <w:sz-cs w:val="24"/>
+        </w:rPr>
+        <w:t xml:space="preserve"/>
+        <w:tab/>
+        <w:t xml:space="preserve">•</w:t>
+        <w:tab/>
+        <w:t xml:space="preserve"/>
+      </w:r>
+      <w:r>
+        <w:rPr>
+          <w:rFonts w:ascii="Times" w:hAnsi="Times" w:cs="Times"/>
+          <w:sz w:val="24"/>
+          <w:sz-cs w:val="24"/>
+          <w:spacing w:val="0"/>
+        </w:rPr>
+        <w:t xml:space="preserve">Aspect Ratio</w:t>
+      </w:r>
+    </w:p>
+    <w:p>
+      <w:pPr>
+        <w:ind w:left="720" w:first-line="-720"/>
+      </w:pPr>
+      <w:r>
+        <w:rPr>
+          <w:rFonts w:ascii="Times" w:hAnsi="Times" w:cs="Times"/>
+          <w:sz w:val="24"/>
+          <w:sz-cs w:val="24"/>
+        </w:rPr>
+        <w:t xml:space="preserve"/>
+        <w:tab/>
+        <w:t xml:space="preserve">•</w:t>
+        <w:tab/>
+        <w:t xml:space="preserve"/>
+      </w:r>
+      <w:r>
+        <w:rPr>
+          <w:rFonts w:ascii="Times" w:hAnsi="Times" w:cs="Times"/>
+          <w:sz w:val="24"/>
+          <w:sz-cs w:val="24"/>
+          <w:spacing w:val="0"/>
+        </w:rPr>
         <w:t xml:space="preserve">Dimensions</w:t>
       </w:r>
     </w:p>
@@ -6698,6 +7016,147 @@
           <w:spacing w:val="0"/>
         </w:rPr>
         <w:t xml:space="preserve">title</w:t>
+      </w:r>
+      <w:r>
+        <w:rPr>
+          <w:rFonts w:ascii="Times" w:hAnsi="Times" w:cs="Times"/>
+          <w:sz w:val="24"/>
+          <w:sz-cs w:val="24"/>
+          <w:spacing w:val="0"/>
+        </w:rPr>
+        <w:t xml:space="preserve">, </w:t>
+      </w:r>
+      <w:r>
+        <w:rPr>
+          <w:rFonts w:ascii="Courier" w:hAnsi="Courier" w:cs="Courier"/>
+          <w:sz w:val="26"/>
+          <w:sz-cs w:val="26"/>
+          <w:spacing w:val="0"/>
+        </w:rPr>
+        <w:t xml:space="preserve">language</w:t>
+      </w:r>
+      <w:r>
+        <w:rPr>
+          <w:rFonts w:ascii="Times" w:hAnsi="Times" w:cs="Times"/>
+          <w:sz w:val="24"/>
+          <w:sz-cs w:val="24"/>
+          <w:spacing w:val="0"/>
+        </w:rPr>
+        <w:t xml:space="preserve">, </w:t>
+      </w:r>
+      <w:r>
+        <w:rPr>
+          <w:rFonts w:ascii="Courier" w:hAnsi="Courier" w:cs="Courier"/>
+          <w:sz w:val="26"/>
+          <w:sz-cs w:val="26"/>
+          <w:spacing w:val="0"/>
+        </w:rPr>
+        <w:t xml:space="preserve">art_tag</w:t>
+      </w:r>
+      <w:r>
+        <w:rPr>
+          <w:rFonts w:ascii="Times" w:hAnsi="Times" w:cs="Times"/>
+          <w:sz w:val="24"/>
+          <w:sz-cs w:val="24"/>
+          <w:spacing w:val="0"/>
+        </w:rPr>
+        <w:t xml:space="preserve">, </w:t>
+      </w:r>
+      <w:r>
+        <w:rPr>
+          <w:rFonts w:ascii="Courier" w:hAnsi="Courier" w:cs="Courier"/>
+          <w:sz w:val="26"/>
+          <w:sz-cs w:val="26"/>
+          <w:spacing w:val="0"/>
+        </w:rPr>
+        <w:t xml:space="preserve">aspect_ratio</w:t>
+      </w:r>
+      <w:r>
+        <w:rPr>
+          <w:rFonts w:ascii="Times" w:hAnsi="Times" w:cs="Times"/>
+          <w:sz w:val="24"/>
+          <w:sz-cs w:val="24"/>
+          <w:spacing w:val="0"/>
+        </w:rPr>
+        <w:t xml:space="preserve">, </w:t>
+      </w:r>
+      <w:r>
+        <w:rPr>
+          <w:rFonts w:ascii="Courier" w:hAnsi="Courier" w:cs="Courier"/>
+          <w:sz w:val="26"/>
+          <w:sz-cs w:val="26"/>
+          <w:spacing w:val="0"/>
+        </w:rPr>
+        <w:t xml:space="preserve">dimensions</w:t>
+      </w:r>
+      <w:r>
+        <w:rPr>
+          <w:rFonts w:ascii="Times" w:hAnsi="Times" w:cs="Times"/>
+          <w:sz w:val="24"/>
+          <w:sz-cs w:val="24"/>
+          <w:spacing w:val="0"/>
+        </w:rPr>
+        <w:t xml:space="preserve"/>
+      </w:r>
+    </w:p>
+    <w:p>
+      <w:pPr/>
+      <w:r>
+        <w:rPr>
+          <w:rFonts w:ascii="Times" w:hAnsi="Times" w:cs="Times"/>
+          <w:sz w:val="24"/>
+          <w:sz-cs w:val="24"/>
+          <w:spacing w:val="0"/>
+        </w:rPr>
+        <w:t xml:space="preserve">Virtual Screening Episode</w:t>
+      </w:r>
+    </w:p>
+    <w:p>
+      <w:pPr/>
+      <w:r>
+        <w:rPr>
+          <w:rFonts w:ascii="Courier" w:hAnsi="Courier" w:cs="Courier"/>
+          <w:sz w:val="26"/>
+          <w:sz-cs w:val="26"/>
+          <w:spacing w:val="0"/>
+        </w:rPr>
+        <w:t xml:space="preserve">title</w:t>
+      </w:r>
+      <w:r>
+        <w:rPr>
+          <w:rFonts w:ascii="Times" w:hAnsi="Times" w:cs="Times"/>
+          <w:sz w:val="24"/>
+          <w:sz-cs w:val="24"/>
+          <w:spacing w:val="0"/>
+        </w:rPr>
+        <w:t xml:space="preserve">, </w:t>
+      </w:r>
+      <w:r>
+        <w:rPr>
+          <w:rFonts w:ascii="Courier" w:hAnsi="Courier" w:cs="Courier"/>
+          <w:sz w:val="26"/>
+          <w:sz-cs w:val="26"/>
+          <w:spacing w:val="0"/>
+        </w:rPr>
+        <w:t xml:space="preserve">season</w:t>
+      </w:r>
+      <w:r>
+        <w:rPr>
+          <w:rFonts w:ascii="Times" w:hAnsi="Times" w:cs="Times"/>
+          <w:sz w:val="24"/>
+          <w:sz-cs w:val="24"/>
+          <w:spacing w:val="0"/>
+        </w:rPr>
+        <w:t xml:space="preserve">, </w:t>
+      </w:r>
+      <w:r>
+        <w:rPr>
+          <w:rFonts w:ascii="Courier" w:hAnsi="Courier" w:cs="Courier"/>
+          <w:sz w:val="26"/>
+          <w:sz-cs w:val="26"/>
+          <w:spacing w:val="0"/>
+        </w:rPr>
+        <w:t xml:space="preserve">episode</w:t>
       </w:r>
       <w:r>
         <w:rPr>

</xml_diff>